<commit_message>
docs(vv): logo CAUR dans l'en-tete du rapport Word (GDD gauche, CAUR droite)
</commit_message>
<xml_diff>
--- a/docs/Rapport_VV_campagne.docx
+++ b/docs/Rapport_VV_campagne.docx
@@ -4066,6 +4066,9 @@
   <w:p>
     <w:pPr>
       <w:pStyle w:val="Header"/>
+      <w:tabs>
+        <w:tab w:pos="9524" w:val="right"/>
+      </w:tabs>
       <w:jc w:val="left"/>
     </w:pPr>
     <w:r>
@@ -4109,6 +4112,41 @@
         <w:sz w:val="22"/>
       </w:rPr>
       <w:t xml:space="preserve">    Instrumentation GDD inc.</w:t>
+    </w:r>
+    <w:r>
+      <w:tab/>
+      <w:drawing>
+        <wp:inline xmlns:a="http://schemas.openxmlformats.org/drawingml/2006/main" xmlns:pic="http://schemas.openxmlformats.org/drawingml/2006/picture">
+          <wp:extent cx="907200" cy="378000"/>
+          <wp:docPr id="2" name="Picture 2"/>
+          <wp:cNvGraphicFramePr>
+            <a:graphicFrameLocks noChangeAspect="1"/>
+          </wp:cNvGraphicFramePr>
+          <a:graphic>
+            <a:graphicData uri="http://schemas.openxmlformats.org/drawingml/2006/picture">
+              <pic:pic>
+                <pic:nvPicPr>
+                  <pic:cNvPr id="0" name="Caur-Logo.png"/>
+                  <pic:cNvPicPr/>
+                </pic:nvPicPr>
+                <pic:blipFill>
+                  <a:blip r:embed="rId2"/>
+                  <a:stretch>
+                    <a:fillRect/>
+                  </a:stretch>
+                </pic:blipFill>
+                <pic:spPr>
+                  <a:xfrm>
+                    <a:off x="0" y="0"/>
+                    <a:ext cx="907200" cy="378000"/>
+                  </a:xfrm>
+                  <a:prstGeom prst="rect"/>
+                </pic:spPr>
+              </pic:pic>
+            </a:graphicData>
+          </a:graphic>
+        </wp:inline>
+      </w:drawing>
     </w:r>
   </w:p>
 </w:hdr>

</xml_diff>

<commit_message>
docs(vv): en-tete en tableau 2 cellules — logo CAUR cale a droite
</commit_message>
<xml_diff>
--- a/docs/Rapport_VV_campagne.docx
+++ b/docs/Rapport_VV_campagne.docx
@@ -4066,89 +4066,117 @@
   <w:p>
     <w:pPr>
       <w:pStyle w:val="Header"/>
-      <w:tabs>
-        <w:tab w:pos="9524" w:val="right"/>
-      </w:tabs>
-      <w:jc w:val="left"/>
     </w:pPr>
-    <w:r>
-      <w:drawing>
-        <wp:inline xmlns:a="http://schemas.openxmlformats.org/drawingml/2006/main" xmlns:pic="http://schemas.openxmlformats.org/drawingml/2006/picture">
-          <wp:extent cx="633036" cy="378000"/>
-          <wp:docPr id="1" name="Picture 1"/>
-          <wp:cNvGraphicFramePr>
-            <a:graphicFrameLocks noChangeAspect="1"/>
-          </wp:cNvGraphicFramePr>
-          <a:graphic>
-            <a:graphicData uri="http://schemas.openxmlformats.org/drawingml/2006/picture">
-              <pic:pic>
-                <pic:nvPicPr>
-                  <pic:cNvPr id="0" name="gdd-logo1.png"/>
-                  <pic:cNvPicPr/>
-                </pic:nvPicPr>
-                <pic:blipFill>
-                  <a:blip r:embed="rId1"/>
-                  <a:stretch>
-                    <a:fillRect/>
-                  </a:stretch>
-                </pic:blipFill>
-                <pic:spPr>
-                  <a:xfrm>
-                    <a:off x="0" y="0"/>
-                    <a:ext cx="633036" cy="378000"/>
-                  </a:xfrm>
-                  <a:prstGeom prst="rect"/>
-                </pic:spPr>
-              </pic:pic>
-            </a:graphicData>
-          </a:graphic>
-        </wp:inline>
-      </w:drawing>
-    </w:r>
-    <w:r>
-      <w:rPr>
-        <w:b/>
-        <w:color w:val="1B4E8C"/>
-        <w:sz w:val="22"/>
-      </w:rPr>
-      <w:t xml:space="preserve">    Instrumentation GDD inc.</w:t>
-    </w:r>
-    <w:r>
-      <w:tab/>
-      <w:drawing>
-        <wp:inline xmlns:a="http://schemas.openxmlformats.org/drawingml/2006/main" xmlns:pic="http://schemas.openxmlformats.org/drawingml/2006/picture">
-          <wp:extent cx="907200" cy="378000"/>
-          <wp:docPr id="2" name="Picture 2"/>
-          <wp:cNvGraphicFramePr>
-            <a:graphicFrameLocks noChangeAspect="1"/>
-          </wp:cNvGraphicFramePr>
-          <a:graphic>
-            <a:graphicData uri="http://schemas.openxmlformats.org/drawingml/2006/picture">
-              <pic:pic>
-                <pic:nvPicPr>
-                  <pic:cNvPr id="0" name="Caur-Logo.png"/>
-                  <pic:cNvPicPr/>
-                </pic:nvPicPr>
-                <pic:blipFill>
-                  <a:blip r:embed="rId2"/>
-                  <a:stretch>
-                    <a:fillRect/>
-                  </a:stretch>
-                </pic:blipFill>
-                <pic:spPr>
-                  <a:xfrm>
-                    <a:off x="0" y="0"/>
-                    <a:ext cx="907200" cy="378000"/>
-                  </a:xfrm>
-                  <a:prstGeom prst="rect"/>
-                </pic:spPr>
-              </pic:pic>
-            </a:graphicData>
-          </a:graphic>
-        </wp:inline>
-      </w:drawing>
-    </w:r>
   </w:p>
+  <w:tbl>
+    <w:tblPr>
+      <w:tblW w:type="auto" w:w="0"/>
+      <w:tblLayout w:type="fixed"/>
+      <w:tblLook w:firstColumn="1" w:firstRow="1" w:lastColumn="0" w:lastRow="0" w:noHBand="0" w:noVBand="1" w:val="04A0"/>
+    </w:tblPr>
+    <w:tblGrid>
+      <w:gridCol w:w="4762"/>
+      <w:gridCol w:w="4762"/>
+    </w:tblGrid>
+    <w:tr>
+      <w:tc>
+        <w:tcPr>
+          <w:tcW w:type="dxa" w:w="6406"/>
+        </w:tcPr>
+        <w:p>
+          <w:pPr>
+            <w:jc w:val="left"/>
+          </w:pPr>
+          <w:r>
+            <w:drawing>
+              <wp:inline xmlns:a="http://schemas.openxmlformats.org/drawingml/2006/main" xmlns:pic="http://schemas.openxmlformats.org/drawingml/2006/picture">
+                <wp:extent cx="633036" cy="378000"/>
+                <wp:docPr id="1" name="Picture 1"/>
+                <wp:cNvGraphicFramePr>
+                  <a:graphicFrameLocks noChangeAspect="1"/>
+                </wp:cNvGraphicFramePr>
+                <a:graphic>
+                  <a:graphicData uri="http://schemas.openxmlformats.org/drawingml/2006/picture">
+                    <pic:pic>
+                      <pic:nvPicPr>
+                        <pic:cNvPr id="0" name="gdd-logo1.png"/>
+                        <pic:cNvPicPr/>
+                      </pic:nvPicPr>
+                      <pic:blipFill>
+                        <a:blip r:embed="rId1"/>
+                        <a:stretch>
+                          <a:fillRect/>
+                        </a:stretch>
+                      </pic:blipFill>
+                      <pic:spPr>
+                        <a:xfrm>
+                          <a:off x="0" y="0"/>
+                          <a:ext cx="633036" cy="378000"/>
+                        </a:xfrm>
+                        <a:prstGeom prst="rect"/>
+                      </pic:spPr>
+                    </pic:pic>
+                  </a:graphicData>
+                </a:graphic>
+              </wp:inline>
+            </w:drawing>
+          </w:r>
+          <w:r>
+            <w:rPr>
+              <w:b/>
+              <w:color w:val="1B4E8C"/>
+              <w:sz w:val="22"/>
+            </w:rPr>
+            <w:t xml:space="preserve">    Instrumentation GDD inc.</w:t>
+          </w:r>
+        </w:p>
+      </w:tc>
+      <w:tc>
+        <w:tcPr>
+          <w:tcW w:type="dxa" w:w="3118"/>
+        </w:tcPr>
+        <w:p>
+          <w:pPr>
+            <w:jc w:val="right"/>
+          </w:pPr>
+          <w:r>
+            <w:drawing>
+              <wp:inline xmlns:a="http://schemas.openxmlformats.org/drawingml/2006/main" xmlns:pic="http://schemas.openxmlformats.org/drawingml/2006/picture">
+                <wp:extent cx="950400" cy="396000"/>
+                <wp:docPr id="2" name="Picture 2"/>
+                <wp:cNvGraphicFramePr>
+                  <a:graphicFrameLocks noChangeAspect="1"/>
+                </wp:cNvGraphicFramePr>
+                <a:graphic>
+                  <a:graphicData uri="http://schemas.openxmlformats.org/drawingml/2006/picture">
+                    <pic:pic>
+                      <pic:nvPicPr>
+                        <pic:cNvPr id="0" name="Caur-Logo.png"/>
+                        <pic:cNvPicPr/>
+                      </pic:nvPicPr>
+                      <pic:blipFill>
+                        <a:blip r:embed="rId2"/>
+                        <a:stretch>
+                          <a:fillRect/>
+                        </a:stretch>
+                      </pic:blipFill>
+                      <pic:spPr>
+                        <a:xfrm>
+                          <a:off x="0" y="0"/>
+                          <a:ext cx="950400" cy="396000"/>
+                        </a:xfrm>
+                        <a:prstGeom prst="rect"/>
+                      </pic:spPr>
+                    </pic:pic>
+                  </a:graphicData>
+                </a:graphic>
+              </wp:inline>
+            </w:drawing>
+          </w:r>
+        </w:p>
+      </w:tc>
+    </w:tr>
+  </w:tbl>
 </w:hdr>
 </file>
 

</xml_diff>